<commit_message>
Add references section and fix interaction interpretation in Actividad 8
</commit_message>
<xml_diff>
--- a/2do-semestre/almacenamiento/tareas/Actividad 8/Actividad8_AlmacenamientoGBD_CarlosPulidoRosas.docx
+++ b/2do-semestre/almacenamiento/tareas/Actividad 8/Actividad8_AlmacenamientoGBD_CarlosPulidoRosas.docx
@@ -6110,6 +6110,154 @@
     <w:p>
       <w:pPr>
         <w:spacing w:before="120" w:after="0"/>
+        <w:jc w:val="left"/>
+      </w:pPr>
+    </w:p>
+    <w:p>
+      <w:pPr>
+        <w:spacing w:before="200" w:after="60"/>
+        <w:jc w:val="left"/>
+      </w:pPr>
+      <w:r>
+        <w:rPr>
+          <w:rFonts w:ascii="Calibri" w:hAnsi="Calibri"/>
+          <w:b/>
+          <w:i w:val="0"/>
+          <w:color w:val="1F497D"/>
+          <w:sz w:val="26"/>
+        </w:rPr>
+        <w:t>6. Referencias</w:t>
+      </w:r>
+    </w:p>
+    <w:p>
+      <w:pPr>
+        <w:spacing w:after="80" w:before="0"/>
+        <w:ind w:left="560" w:hanging="560"/>
+      </w:pPr>
+      <w:r>
+        <w:rPr>
+          <w:rFonts w:ascii="Calibri" w:hAnsi="Calibri"/>
+          <w:color w:val="000000"/>
+          <w:sz w:val="19"/>
+        </w:rPr>
+        <w:t>Fawcett, T. (2006). An introduction to ROC analysis. Pattern Recognition Letters, 27(8), 861-874. https://doi.org/10.1016/j.patrec.2005.10.010</w:t>
+      </w:r>
+    </w:p>
+    <w:p>
+      <w:pPr>
+        <w:spacing w:after="80" w:before="0"/>
+        <w:ind w:left="560" w:hanging="560"/>
+      </w:pPr>
+      <w:r>
+        <w:rPr>
+          <w:rFonts w:ascii="Calibri" w:hAnsi="Calibri"/>
+          <w:color w:val="000000"/>
+          <w:sz w:val="19"/>
+        </w:rPr>
+        <w:t>Goldin, C. (2014). A grand gender convergence: Its last chapter. American Economic Review, 104(4), 1091-1119. https://doi.org/10.1257/aer.104.4.1091</w:t>
+      </w:r>
+    </w:p>
+    <w:p>
+      <w:pPr>
+        <w:spacing w:after="80" w:before="0"/>
+        <w:ind w:left="560" w:hanging="560"/>
+      </w:pPr>
+      <w:r>
+        <w:rPr>
+          <w:rFonts w:ascii="Calibri" w:hAnsi="Calibri"/>
+          <w:color w:val="000000"/>
+          <w:sz w:val="19"/>
+        </w:rPr>
+        <w:t>Greene, W. H. (2018). Econometric Analysis (8a ed.). Pearson.</w:t>
+      </w:r>
+    </w:p>
+    <w:p>
+      <w:pPr>
+        <w:spacing w:after="80" w:before="0"/>
+        <w:ind w:left="560" w:hanging="560"/>
+      </w:pPr>
+      <w:r>
+        <w:rPr>
+          <w:rFonts w:ascii="Calibri" w:hAnsi="Calibri"/>
+          <w:color w:val="000000"/>
+          <w:sz w:val="19"/>
+        </w:rPr>
+        <w:t>Hosmer, D. W., Lemeshow, S., &amp; Sturdivant, R. X. (2013). Applied Logistic Regression (3a ed.). John Wiley &amp; Sons. https://doi.org/10.1002/9781118548387</w:t>
+      </w:r>
+    </w:p>
+    <w:p>
+      <w:pPr>
+        <w:spacing w:after="80" w:before="0"/>
+        <w:ind w:left="560" w:hanging="560"/>
+      </w:pPr>
+      <w:r>
+        <w:rPr>
+          <w:rFonts w:ascii="Calibri" w:hAnsi="Calibri"/>
+          <w:color w:val="000000"/>
+          <w:sz w:val="19"/>
+        </w:rPr>
+        <w:t>Instituto Mexicano del Seguro Social [IMSS]. (2026). Asegurados por grupo (ASG) — Abril 2026 [Conjunto de datos]. Datos Abiertos IMSS. https://datos.imss.gob.mx/</w:t>
+      </w:r>
+    </w:p>
+    <w:p>
+      <w:pPr>
+        <w:spacing w:after="80" w:before="0"/>
+        <w:ind w:left="560" w:hanging="560"/>
+      </w:pPr>
+      <w:r>
+        <w:rPr>
+          <w:rFonts w:ascii="Calibri" w:hAnsi="Calibri"/>
+          <w:color w:val="000000"/>
+          <w:sz w:val="19"/>
+        </w:rPr>
+        <w:t>Mincer, J. (1974). Schooling, Experience, and Earnings. Columbia University Press / National Bureau of Economic Research.</w:t>
+      </w:r>
+    </w:p>
+    <w:p>
+      <w:pPr>
+        <w:spacing w:after="80" w:before="0"/>
+        <w:ind w:left="560" w:hanging="560"/>
+      </w:pPr>
+      <w:r>
+        <w:rPr>
+          <w:rFonts w:ascii="Calibri" w:hAnsi="Calibri"/>
+          <w:color w:val="000000"/>
+          <w:sz w:val="19"/>
+        </w:rPr>
+        <w:t>Pedregosa, F., Varoquaux, G., Gramfort, A., Michel, V., Thirion, B., Grisel, O., Blondel, M., Prettenhofer, P., Weiss, R., Dubourg, V., Vanderplas, J., Passos, A., Cournapeau, D., Brucher, M., Perrot, M., &amp; Duchesnay, E. (2011). Scikit-learn: Machine learning in Python. Journal of Machine Learning Research, 12, 2825-2830.</w:t>
+      </w:r>
+    </w:p>
+    <w:p>
+      <w:pPr>
+        <w:spacing w:after="80" w:before="0"/>
+        <w:ind w:left="560" w:hanging="560"/>
+      </w:pPr>
+      <w:r>
+        <w:rPr>
+          <w:rFonts w:ascii="Calibri" w:hAnsi="Calibri"/>
+          <w:color w:val="000000"/>
+          <w:sz w:val="19"/>
+        </w:rPr>
+        <w:t>Seabold, S., &amp; Perktold, J. (2010). Statsmodels: Econometric and statistical modeling with Python. Proceedings of the 9th Python in Science Conference (SciPy 2010), 57-61. https://doi.org/10.25080/Majora-92bf1922-011</w:t>
+      </w:r>
+    </w:p>
+    <w:p>
+      <w:pPr>
+        <w:spacing w:after="80" w:before="0"/>
+        <w:ind w:left="560" w:hanging="560"/>
+      </w:pPr>
+      <w:r>
+        <w:rPr>
+          <w:rFonts w:ascii="Calibri" w:hAnsi="Calibri"/>
+          <w:color w:val="000000"/>
+          <w:sz w:val="19"/>
+        </w:rPr>
+        <w:t>Wooldridge, J. M. (2010). Econometric Analysis of Cross Section and Panel Data (2a ed.). MIT Press.</w:t>
+      </w:r>
+    </w:p>
+    <w:p>
+      <w:pPr>
+        <w:spacing w:before="80" w:after="0"/>
         <w:jc w:val="left"/>
       </w:pPr>
     </w:p>

</xml_diff>